<commit_message>
feat: add email as a second factor for authentication
- Implemented email-based two-factor authentication (2FA) alongside TOTP.
- Created API handler for sending and verifying email codes.
- Added database migration for email MFA support, including necessary tables and columns.
- Updated user profile management to include email MFA status.
- Enhanced the UI to allow users to enable/disable email MFA.
- Added tests to ensure security measures and functionality of the email factor.
- Updated internationalization files to support new email MFA messages.
</commit_message>
<xml_diff>
--- a/docs/Groundwork-BQ-Questions-Vanessa.docx
+++ b/docs/Groundwork-BQ-Questions-Vanessa.docx
@@ -38,7 +38,7 @@
           <w:color w:val="666666"/>
           <w:sz w:val="19"/>
         </w:rPr>
-        <w:t>Groundwork by Jalla   ·   17 August 2026</w:t>
+        <w:t>Groundwork by Jalla   ·   9 September 2026</w:t>
       </w:r>
     </w:p>
     <w:tbl>
@@ -84,7 +84,41 @@
                 <w:color w:val="111111"/>
                 <w:sz w:val="20"/>
               </w:rPr>
-              <w:t xml:space="preserve">  We built Groundwork’s cost estimator from four of your bills of quantities. It now reproduces them to within about 21% under and 31% over, against 146% over when it was built from a single document.</w:t>
+              <w:t xml:space="preserve">  We built Groundwork’s cost estimator from four of your bills of quantities. </w:t>
+            </w:r>
+            <w:r>
+              <w:rPr>
+                <w:b/>
+                <w:color w:val="111111"/>
+                <w:sz w:val="20"/>
+              </w:rPr>
+              <w:t>Naka now reproduces to within 1%</w:t>
+            </w:r>
+            <w:r>
+              <w:rPr>
+                <w:b w:val="0"/>
+                <w:color w:val="111111"/>
+                <w:sz w:val="20"/>
+              </w:rPr>
+              <w:t xml:space="preserve"> — it is the only one of the four that priced a whole building the way we do, so it is the fairest measure. The other three each price a different scope.</w:t>
+              <w:br/>
+              <w:br/>
+            </w:r>
+            <w:r>
+              <w:rPr>
+                <w:b/>
+                <w:color w:val="111111"/>
+                <w:sz w:val="20"/>
+              </w:rPr>
+              <w:t>Thank you for the 4 September answers.</w:t>
+            </w:r>
+            <w:r>
+              <w:rPr>
+                <w:b w:val="0"/>
+                <w:color w:val="111111"/>
+                <w:sz w:val="20"/>
+              </w:rPr>
+              <w:t xml:space="preserve">  The timeline rule, the four professional fee lines, 2% contingency and the 5,000 XAF/m² design fee are all in and shipped. Please do not spend time on those again.</w:t>
               <w:br/>
               <w:br/>
               <w:t>The remaining gap sits in a small number of specific line items where your four documents disagree with one another, and we cannot tell from the files alone which reading is the correct one. Each question below is one of those. Every one you answer lets us tighten a real figure.</w:t>
@@ -626,10 +660,11 @@
         </w:tblBorders>
       </w:tblPr>
       <w:tblGrid>
-        <w:gridCol w:w="2381"/>
-        <w:gridCol w:w="2381"/>
-        <w:gridCol w:w="2381"/>
-        <w:gridCol w:w="2154"/>
+        <w:gridCol w:w="2041"/>
+        <w:gridCol w:w="1928"/>
+        <w:gridCol w:w="1928"/>
+        <w:gridCol w:w="1701"/>
+        <w:gridCol w:w="1701"/>
       </w:tblGrid>
       <w:tr>
         <w:trPr>
@@ -638,7 +673,7 @@
         </w:trPr>
         <w:tc>
           <w:tcPr>
-            <w:tcW w:type="dxa" w:w="2381"/>
+            <w:tcW w:type="dxa" w:w="2041"/>
             <w:shd w:fill="EDEDED"/>
           </w:tcPr>
           <w:p>
@@ -656,7 +691,7 @@
         </w:tc>
         <w:tc>
           <w:tcPr>
-            <w:tcW w:type="dxa" w:w="2381"/>
+            <w:tcW w:type="dxa" w:w="1928"/>
             <w:shd w:fill="EDEDED"/>
           </w:tcPr>
           <w:p>
@@ -674,7 +709,7 @@
         </w:tc>
         <w:tc>
           <w:tcPr>
-            <w:tcW w:type="dxa" w:w="2381"/>
+            <w:tcW w:type="dxa" w:w="1928"/>
             <w:shd w:fill="EDEDED"/>
           </w:tcPr>
           <w:p>
@@ -692,7 +727,7 @@
         </w:tc>
         <w:tc>
           <w:tcPr>
-            <w:tcW w:type="dxa" w:w="2154"/>
+            <w:tcW w:type="dxa" w:w="1701"/>
             <w:shd w:fill="EDEDED"/>
           </w:tcPr>
           <w:p>
@@ -705,6 +740,24 @@
                 <w:sz w:val="19"/>
               </w:rPr>
               <w:t>Difference</w:t>
+            </w:r>
+          </w:p>
+        </w:tc>
+        <w:tc>
+          <w:tcPr>
+            <w:tcW w:type="dxa" w:w="1701"/>
+            <w:shd w:fill="EDEDED"/>
+          </w:tcPr>
+          <w:p>
+            <w:pPr>
+              <w:spacing w:after="20"/>
+            </w:pPr>
+            <w:r>
+              <w:rPr>
+                <w:b/>
+                <w:sz w:val="19"/>
+              </w:rPr>
+              <w:t>In August</w:t>
             </w:r>
           </w:p>
         </w:tc>
@@ -715,7 +768,7 @@
         </w:trPr>
         <w:tc>
           <w:tcPr>
-            <w:tcW w:type="dxa" w:w="2381"/>
+            <w:tcW w:type="dxa" w:w="2041"/>
           </w:tcPr>
           <w:p>
             <w:pPr>
@@ -733,7 +786,7 @@
         </w:tc>
         <w:tc>
           <w:tcPr>
-            <w:tcW w:type="dxa" w:w="2381"/>
+            <w:tcW w:type="dxa" w:w="1928"/>
           </w:tcPr>
           <w:p>
             <w:pPr>
@@ -751,7 +804,7 @@
         </w:tc>
         <w:tc>
           <w:tcPr>
-            <w:tcW w:type="dxa" w:w="2381"/>
+            <w:tcW w:type="dxa" w:w="1928"/>
           </w:tcPr>
           <w:p>
             <w:pPr>
@@ -763,13 +816,13 @@
                 <w:color w:val="111111"/>
                 <w:sz w:val="19"/>
               </w:rPr>
-              <w:t>39,943,940</w:t>
+              <w:t>41,732,608</w:t>
             </w:r>
           </w:p>
         </w:tc>
         <w:tc>
           <w:tcPr>
-            <w:tcW w:type="dxa" w:w="2154"/>
+            <w:tcW w:type="dxa" w:w="1701"/>
           </w:tcPr>
           <w:p>
             <w:pPr>
@@ -778,6 +831,24 @@
             <w:r>
               <w:rPr>
                 <w:b/>
+                <w:color w:val="111111"/>
+                <w:sz w:val="19"/>
+              </w:rPr>
+              <w:t>−1.1%</w:t>
+            </w:r>
+          </w:p>
+        </w:tc>
+        <w:tc>
+          <w:tcPr>
+            <w:tcW w:type="dxa" w:w="1701"/>
+          </w:tcPr>
+          <w:p>
+            <w:pPr>
+              <w:spacing w:after="20"/>
+            </w:pPr>
+            <w:r>
+              <w:rPr>
+                <w:b w:val="0"/>
                 <w:color w:val="111111"/>
                 <w:sz w:val="19"/>
               </w:rPr>
@@ -792,7 +863,7 @@
         </w:trPr>
         <w:tc>
           <w:tcPr>
-            <w:tcW w:type="dxa" w:w="2381"/>
+            <w:tcW w:type="dxa" w:w="2041"/>
           </w:tcPr>
           <w:p>
             <w:pPr>
@@ -810,7 +881,7 @@
         </w:tc>
         <w:tc>
           <w:tcPr>
-            <w:tcW w:type="dxa" w:w="2381"/>
+            <w:tcW w:type="dxa" w:w="1928"/>
           </w:tcPr>
           <w:p>
             <w:pPr>
@@ -828,7 +899,7 @@
         </w:tc>
         <w:tc>
           <w:tcPr>
-            <w:tcW w:type="dxa" w:w="2381"/>
+            <w:tcW w:type="dxa" w:w="1928"/>
           </w:tcPr>
           <w:p>
             <w:pPr>
@@ -840,13 +911,31 @@
                 <w:color w:val="111111"/>
                 <w:sz w:val="19"/>
               </w:rPr>
-              <w:t>51,027,448</w:t>
+              <w:t>51,803,389</w:t>
             </w:r>
           </w:p>
         </w:tc>
         <w:tc>
           <w:tcPr>
-            <w:tcW w:type="dxa" w:w="2154"/>
+            <w:tcW w:type="dxa" w:w="1701"/>
+          </w:tcPr>
+          <w:p>
+            <w:pPr>
+              <w:spacing w:after="20"/>
+            </w:pPr>
+            <w:r>
+              <w:rPr>
+                <w:b w:val="0"/>
+                <w:color w:val="111111"/>
+                <w:sz w:val="19"/>
+              </w:rPr>
+              <w:t>+19.3%</w:t>
+            </w:r>
+          </w:p>
+        </w:tc>
+        <w:tc>
+          <w:tcPr>
+            <w:tcW w:type="dxa" w:w="1701"/>
           </w:tcPr>
           <w:p>
             <w:pPr>
@@ -869,7 +958,7 @@
         </w:trPr>
         <w:tc>
           <w:tcPr>
-            <w:tcW w:type="dxa" w:w="2381"/>
+            <w:tcW w:type="dxa" w:w="2041"/>
           </w:tcPr>
           <w:p>
             <w:pPr>
@@ -887,7 +976,7 @@
         </w:tc>
         <w:tc>
           <w:tcPr>
-            <w:tcW w:type="dxa" w:w="2381"/>
+            <w:tcW w:type="dxa" w:w="1928"/>
           </w:tcPr>
           <w:p>
             <w:pPr>
@@ -905,7 +994,7 @@
         </w:tc>
         <w:tc>
           <w:tcPr>
-            <w:tcW w:type="dxa" w:w="2381"/>
+            <w:tcW w:type="dxa" w:w="1928"/>
           </w:tcPr>
           <w:p>
             <w:pPr>
@@ -917,13 +1006,31 @@
                 <w:color w:val="111111"/>
                 <w:sz w:val="19"/>
               </w:rPr>
-              <w:t>47,301,063</w:t>
+              <w:t>50,959,788</w:t>
             </w:r>
           </w:p>
         </w:tc>
         <w:tc>
           <w:tcPr>
-            <w:tcW w:type="dxa" w:w="2154"/>
+            <w:tcW w:type="dxa" w:w="1701"/>
+          </w:tcPr>
+          <w:p>
+            <w:pPr>
+              <w:spacing w:after="20"/>
+            </w:pPr>
+            <w:r>
+              <w:rPr>
+                <w:b w:val="0"/>
+                <w:color w:val="111111"/>
+                <w:sz w:val="19"/>
+              </w:rPr>
+              <w:t>−14.6%</w:t>
+            </w:r>
+          </w:p>
+        </w:tc>
+        <w:tc>
+          <w:tcPr>
+            <w:tcW w:type="dxa" w:w="1701"/>
           </w:tcPr>
           <w:p>
             <w:pPr>
@@ -946,7 +1053,7 @@
         </w:trPr>
         <w:tc>
           <w:tcPr>
-            <w:tcW w:type="dxa" w:w="2381"/>
+            <w:tcW w:type="dxa" w:w="2041"/>
           </w:tcPr>
           <w:p>
             <w:pPr>
@@ -964,7 +1071,7 @@
         </w:tc>
         <w:tc>
           <w:tcPr>
-            <w:tcW w:type="dxa" w:w="2381"/>
+            <w:tcW w:type="dxa" w:w="1928"/>
           </w:tcPr>
           <w:p>
             <w:pPr>
@@ -982,7 +1089,7 @@
         </w:tc>
         <w:tc>
           <w:tcPr>
-            <w:tcW w:type="dxa" w:w="2381"/>
+            <w:tcW w:type="dxa" w:w="1928"/>
           </w:tcPr>
           <w:p>
             <w:pPr>
@@ -994,13 +1101,31 @@
                 <w:color w:val="111111"/>
                 <w:sz w:val="19"/>
               </w:rPr>
-              <w:t>84,228,987</w:t>
+              <w:t>97,732,073</w:t>
             </w:r>
           </w:p>
         </w:tc>
         <w:tc>
           <w:tcPr>
-            <w:tcW w:type="dxa" w:w="2154"/>
+            <w:tcW w:type="dxa" w:w="1701"/>
+          </w:tcPr>
+          <w:p>
+            <w:pPr>
+              <w:spacing w:after="20"/>
+            </w:pPr>
+            <w:r>
+              <w:rPr>
+                <w:b/>
+                <w:color w:val="111111"/>
+                <w:sz w:val="19"/>
+              </w:rPr>
+              <w:t>+52.1%</w:t>
+            </w:r>
+          </w:p>
+        </w:tc>
+        <w:tc>
+          <w:tcPr>
+            <w:tcW w:type="dxa" w:w="1701"/>
           </w:tcPr>
           <w:p>
             <w:pPr>
@@ -1033,8 +1158,81 @@
           <w:color w:val="666666"/>
           <w:sz w:val="20"/>
         </w:rPr>
-        <w:t>Naka is closest because it is one of the two documents that measured internal partitions and painted the whole building. The two widest, Rose and Mpangou, are the two carrying the anomalies in Questions 1, 3 and 4 — which is why those three matter most.</w:t>
+        <w:t>Naka is closest because it is the only document that measured internal partitions, painted every floor and priced a whole building — a like-for-like comparison. It is now within 1.1%.</w:t>
       </w:r>
+    </w:p>
+    <w:tbl>
+      <w:tblPr>
+        <w:tblW w:type="auto" w:w="0"/>
+        <w:jc w:val="left"/>
+        <w:tblLayout w:type="fixed"/>
+        <w:tblLook w:firstColumn="1" w:firstRow="1" w:lastColumn="0" w:lastRow="0" w:noHBand="0" w:noVBand="1" w:val="04A0"/>
+        <w:tblLayout w:type="fixed"/>
+        <w:tblBorders>
+          <w:top w:val="single" w:sz="6" w:color="A02020"/>
+          <w:left w:val="single" w:sz="6" w:color="A02020"/>
+          <w:bottom w:val="single" w:sz="6" w:color="A02020"/>
+          <w:right w:val="single" w:sz="6" w:color="A02020"/>
+          <w:insideH w:val="single" w:sz="6" w:color="A02020"/>
+          <w:insideV w:val="single" w:sz="6" w:color="A02020"/>
+        </w:tblBorders>
+      </w:tblPr>
+      <w:tblGrid>
+        <w:gridCol w:w="9298"/>
+      </w:tblGrid>
+      <w:tr>
+        <w:tc>
+          <w:tcPr>
+            <w:tcW w:type="dxa" w:w="9298"/>
+            <w:shd w:fill="FDF3F3"/>
+          </w:tcPr>
+          <w:p>
+            <w:pPr>
+              <w:spacing w:after="0"/>
+            </w:pPr>
+            <w:r>
+              <w:rPr>
+                <w:b/>
+                <w:color w:val="A02020"/>
+                <w:sz w:val="20"/>
+              </w:rPr>
+              <w:t>Mpangou moved further away, and we did that on purpose.</w:t>
+            </w:r>
+            <w:r>
+              <w:rPr>
+                <w:b w:val="0"/>
+                <w:color w:val="A02020"/>
+                <w:sz w:val="20"/>
+              </w:rPr>
+              <w:t xml:space="preserve">  We found a counting error: our estimator charged </w:t>
+            </w:r>
+            <w:r>
+              <w:rPr>
+                <w:b/>
+                <w:color w:val="A02020"/>
+                <w:sz w:val="20"/>
+              </w:rPr>
+              <w:t>one</w:t>
+            </w:r>
+            <w:r>
+              <w:rPr>
+                <w:b w:val="0"/>
+                <w:color w:val="A02020"/>
+                <w:sz w:val="20"/>
+              </w:rPr>
+              <w:t xml:space="preserve"> suspended floor slab, one soffit plaster and one staircase for a building of any height. A suspended slab is the floor of the storey above it, so a G+3 needs three — we were pricing one.</w:t>
+              <w:br/>
+              <w:br/>
+              <w:t>Correcting it added about 8.0 million XAF to Mpangou and changed nothing at all on the three G+1 documents. Mpangou is also the one document pricing a continuation of a half-built structure, so we expect to sit above it. Question 16 asks by how much.</w:t>
+            </w:r>
+          </w:p>
+        </w:tc>
+      </w:tr>
+    </w:tbl>
+    <w:p>
+      <w:pPr>
+        <w:spacing w:after="40"/>
+      </w:pPr>
     </w:p>
     <w:p>
       <w:pPr>
@@ -4393,7 +4591,7 @@
           <w:color w:val="111111"/>
           <w:sz w:val="20"/>
         </w:rPr>
-        <w:t>We treat this figure as an outlier and price a pitched roof at about 20,000 XAF per m² of footprint from first principles. That is a large part of why our estimate reads 20.7% below your Rose total.</w:t>
+        <w:t>We treat this figure as an outlier and price a pitched roof at about 20,000 XAF per m² of footprint from first principles. That is a large part of why our estimate reads 14.6% below your Rose total.</w:t>
       </w:r>
     </w:p>
     <w:p>
@@ -4779,7 +4977,7 @@
           <w:color w:val="111111"/>
           <w:sz w:val="20"/>
         </w:rPr>
-        <w:t>We have taken it as stated in the title. If it is actually four upper floors, the per-floor uplift we derive changes from 20.6% to 15.4%, and this is a direct cause of our +31.1% on this document.</w:t>
+        <w:t>We have taken it as stated in the title. If it is actually four upper floors, the per-floor uplift we derive changes from 20.6% to 15.4%, and this is a direct cause of our +52.1% on this document. It matters more than it did in August: the slab correction above is charged per upper floor, so the floor count decides how many slabs we price.</w:t>
       </w:r>
     </w:p>
     <w:p>
@@ -6303,7 +6501,7 @@
           <w:color w:val="111111"/>
           <w:sz w:val="20"/>
         </w:rPr>
-        <w:t>We model internal partitions at 14 metres of wall per room per floor. Documents 1 and 3 imply 15.5 m and 18 m. That is most of why our estimate reads 17.5% above your Buea total.</w:t>
+        <w:t>We model internal partitions at 14 metres of wall per room per floor. Documents 1 and 3 imply 15.5 m and 18 m. That is most of why our estimate reads 19.3% above your Buea total.</w:t>
       </w:r>
     </w:p>
     <w:p>
@@ -8981,6 +9179,895 @@
             <w:pPr>
               <w:spacing w:after="0"/>
             </w:pPr>
+          </w:p>
+          <w:p>
+            <w:pPr>
+              <w:spacing w:after="0"/>
+            </w:pPr>
+          </w:p>
+          <w:p>
+            <w:pPr>
+              <w:spacing w:after="0"/>
+            </w:pPr>
+          </w:p>
+          <w:p>
+            <w:pPr>
+              <w:spacing w:after="0"/>
+            </w:pPr>
+          </w:p>
+        </w:tc>
+      </w:tr>
+    </w:tbl>
+    <w:p>
+      <w:pPr>
+        <w:spacing w:after="80"/>
+      </w:pPr>
+    </w:p>
+    <w:p>
+      <w:pPr>
+        <w:pageBreakBefore/>
+        <w:spacing w:before="40" w:after="140"/>
+        <w:pBdr>
+          <w:bottom w:val="single" w:sz="8" w:space="3" w:color="111111"/>
+        </w:pBdr>
+      </w:pPr>
+      <w:r>
+        <w:rPr>
+          <w:b/>
+          <w:color w:val="111111"/>
+          <w:sz w:val="30"/>
+        </w:rPr>
+        <w:t>New since we last wrote</w:t>
+      </w:r>
+    </w:p>
+    <w:p>
+      <w:pPr>
+        <w:keepNext/>
+        <w:spacing w:before="240" w:after="60"/>
+      </w:pPr>
+      <w:r>
+        <w:rPr>
+          <w:b/>
+          <w:color w:val="111111"/>
+          <w:sz w:val="25"/>
+        </w:rPr>
+        <w:t>Question 16  —  How much of Mpangou was already built?</w:t>
+      </w:r>
+    </w:p>
+    <w:p>
+      <w:pPr>
+        <w:spacing w:after="40"/>
+      </w:pPr>
+      <w:r>
+        <w:rPr>
+          <w:b/>
+          <w:color w:val="111111"/>
+          <w:sz w:val="20"/>
+        </w:rPr>
+        <w:t>What your document shows</w:t>
+      </w:r>
+    </w:p>
+    <w:p>
+      <w:pPr>
+        <w:spacing w:after="60"/>
+      </w:pPr>
+      <w:r>
+        <w:rPr>
+          <w:b w:val="0"/>
+          <w:color w:val="111111"/>
+          <w:sz w:val="20"/>
+        </w:rPr>
+        <w:t>We now sit 52.1% above your Mpangou figure, up from 31.1%, because we corrected the slab count described earlier. Your document prices one contractor’s continuation of a structure already part-built — your note said it was incomplete and that the existing work was surveyed rather than re-priced.</w:t>
+      </w:r>
+    </w:p>
+    <w:p>
+      <w:pPr>
+        <w:spacing w:after="60"/>
+      </w:pPr>
+      <w:r>
+        <w:rPr>
+          <w:b w:val="0"/>
+          <w:color w:val="111111"/>
+          <w:sz w:val="20"/>
+        </w:rPr>
+        <w:t>Ours prices the whole building from scratch, so some gap is not only expected but correct. We cannot tell how much.</w:t>
+      </w:r>
+    </w:p>
+    <w:p>
+      <w:pPr>
+        <w:spacing w:after="40"/>
+      </w:pPr>
+      <w:r>
+        <w:rPr>
+          <w:b/>
+          <w:color w:val="111111"/>
+          <w:sz w:val="20"/>
+        </w:rPr>
+        <w:t>What we have assumed in the meantime</w:t>
+      </w:r>
+    </w:p>
+    <w:p>
+      <w:pPr>
+        <w:spacing w:after="80"/>
+      </w:pPr>
+      <w:r>
+        <w:rPr>
+          <w:b w:val="0"/>
+          <w:color w:val="111111"/>
+          <w:sz w:val="20"/>
+        </w:rPr>
+        <w:t>That the whole of the difference is explained by scope, which may be too generous to us.</w:t>
+      </w:r>
+    </w:p>
+    <w:p>
+      <w:pPr>
+        <w:spacing w:after="40"/>
+      </w:pPr>
+      <w:r>
+        <w:rPr>
+          <w:b/>
+          <w:color w:val="111111"/>
+          <w:sz w:val="20"/>
+        </w:rPr>
+        <w:t>What we need from you</w:t>
+      </w:r>
+    </w:p>
+    <w:p>
+      <w:r>
+        <w:rPr>
+          <w:b/>
+          <w:color w:val="111111"/>
+          <w:sz w:val="21"/>
+        </w:rPr>
+        <w:t>Roughly what proportion of that building was already standing when you took it over? Even a rough fraction tells us whether +52% is about right or whether we have over-corrected.</w:t>
+      </w:r>
+    </w:p>
+    <w:tbl>
+      <w:tblPr>
+        <w:tblW w:type="auto" w:w="0"/>
+        <w:jc w:val="left"/>
+        <w:tblLayout w:type="fixed"/>
+        <w:tblLook w:firstColumn="1" w:firstRow="1" w:lastColumn="0" w:lastRow="0" w:noHBand="0" w:noVBand="1" w:val="04A0"/>
+        <w:tblLayout w:type="fixed"/>
+        <w:tblBorders>
+          <w:top w:val="single" w:sz="4" w:color="999999"/>
+          <w:left w:val="single" w:sz="4" w:color="999999"/>
+          <w:bottom w:val="single" w:sz="4" w:color="999999"/>
+          <w:right w:val="single" w:sz="4" w:color="999999"/>
+          <w:insideH w:val="single" w:sz="4" w:color="999999"/>
+          <w:insideV w:val="single" w:sz="4" w:color="999999"/>
+        </w:tblBorders>
+      </w:tblPr>
+      <w:tblGrid>
+        <w:gridCol w:w="9298"/>
+      </w:tblGrid>
+      <w:tr>
+        <w:tc>
+          <w:tcPr>
+            <w:tcW w:type="dxa" w:w="9298"/>
+          </w:tcPr>
+          <w:p>
+            <w:pPr>
+              <w:spacing w:after="0"/>
+            </w:pPr>
+            <w:r>
+              <w:rPr>
+                <w:color w:val="666666"/>
+                <w:sz w:val="17"/>
+              </w:rPr>
+              <w:t>Your answer</w:t>
+            </w:r>
+          </w:p>
+          <w:p>
+            <w:pPr>
+              <w:spacing w:after="0"/>
+            </w:pPr>
+          </w:p>
+          <w:p>
+            <w:pPr>
+              <w:spacing w:after="0"/>
+            </w:pPr>
+          </w:p>
+          <w:p>
+            <w:pPr>
+              <w:spacing w:after="0"/>
+            </w:pPr>
+          </w:p>
+        </w:tc>
+      </w:tr>
+    </w:tbl>
+    <w:p>
+      <w:pPr>
+        <w:spacing w:after="80"/>
+      </w:pPr>
+    </w:p>
+    <w:p>
+      <w:pPr>
+        <w:keepNext/>
+        <w:spacing w:before="240" w:after="60"/>
+      </w:pPr>
+      <w:r>
+        <w:rPr>
+          <w:b/>
+          <w:color w:val="111111"/>
+          <w:sz w:val="25"/>
+        </w:rPr>
+        <w:t>Question 17  —  Is 180,000 XAF/m² yours, or our own concrete rate handed back?</w:t>
+      </w:r>
+    </w:p>
+    <w:p>
+      <w:pPr>
+        <w:spacing w:after="40"/>
+      </w:pPr>
+      <w:r>
+        <w:rPr>
+          <w:b/>
+          <w:color w:val="111111"/>
+          <w:sz w:val="20"/>
+        </w:rPr>
+        <w:t>What your document shows</w:t>
+      </w:r>
+    </w:p>
+    <w:p>
+      <w:pPr>
+        <w:spacing w:after="60"/>
+      </w:pPr>
+      <w:r>
+        <w:rPr>
+          <w:b w:val="0"/>
+          <w:color w:val="111111"/>
+          <w:sz w:val="20"/>
+        </w:rPr>
+        <w:t>On 4 September you gave us a quick check: a Yaoundé build runs about 180,000 XAF per built m² — footprint × floors × 180,000. We use it exactly as you described it, as a sanity check and never as a price. If our estimate falls below half of it, the client is told the figure looks low for a building that size and to have a contractor confirm it.</w:t>
+      </w:r>
+    </w:p>
+    <w:p>
+      <w:pPr>
+        <w:spacing w:after="60"/>
+      </w:pPr>
+      <w:r>
+        <w:rPr>
+          <w:b w:val="0"/>
+          <w:color w:val="111111"/>
+          <w:sz w:val="20"/>
+        </w:rPr>
+        <w:t>The reason we are asking is a coincidence we would rather not build on. Your own price book puts Yaoundé RC-350 concrete at 180,000 XAF per cubic metre. Same number, different quantity, different unit.</w:t>
+      </w:r>
+    </w:p>
+    <w:p>
+      <w:pPr>
+        <w:spacing w:after="40"/>
+      </w:pPr>
+      <w:r>
+        <w:rPr>
+          <w:b/>
+          <w:color w:val="111111"/>
+          <w:sz w:val="20"/>
+        </w:rPr>
+        <w:t>What we have assumed in the meantime</w:t>
+      </w:r>
+    </w:p>
+    <w:p>
+      <w:pPr>
+        <w:spacing w:after="80"/>
+      </w:pPr>
+      <w:r>
+        <w:rPr>
+          <w:b w:val="0"/>
+          <w:color w:val="111111"/>
+          <w:sz w:val="20"/>
+        </w:rPr>
+        <w:t>That the per-m² figure is real and separate from the concrete rate.</w:t>
+      </w:r>
+    </w:p>
+    <w:p>
+      <w:pPr>
+        <w:spacing w:after="40"/>
+      </w:pPr>
+      <w:r>
+        <w:rPr>
+          <w:b/>
+          <w:color w:val="111111"/>
+          <w:sz w:val="20"/>
+        </w:rPr>
+        <w:t>What we need from you</w:t>
+      </w:r>
+    </w:p>
+    <w:p>
+      <w:r>
+        <w:rPr>
+          <w:b/>
+          <w:color w:val="111111"/>
+          <w:sz w:val="21"/>
+        </w:rPr>
+        <w:t>Is 180,000 XAF per built m² a genuine rule of thumb, or was that the concrete rate? Both readings are plausible, which is exactly why we do not want to guess — if it is the concrete rate, our warning is calibrated against the wrong figure.</w:t>
+      </w:r>
+    </w:p>
+    <w:tbl>
+      <w:tblPr>
+        <w:tblW w:type="auto" w:w="0"/>
+        <w:jc w:val="left"/>
+        <w:tblLayout w:type="fixed"/>
+        <w:tblLook w:firstColumn="1" w:firstRow="1" w:lastColumn="0" w:lastRow="0" w:noHBand="0" w:noVBand="1" w:val="04A0"/>
+        <w:tblLayout w:type="fixed"/>
+        <w:tblBorders>
+          <w:top w:val="single" w:sz="4" w:color="999999"/>
+          <w:left w:val="single" w:sz="4" w:color="999999"/>
+          <w:bottom w:val="single" w:sz="4" w:color="999999"/>
+          <w:right w:val="single" w:sz="4" w:color="999999"/>
+          <w:insideH w:val="single" w:sz="4" w:color="999999"/>
+          <w:insideV w:val="single" w:sz="4" w:color="999999"/>
+        </w:tblBorders>
+      </w:tblPr>
+      <w:tblGrid>
+        <w:gridCol w:w="9298"/>
+      </w:tblGrid>
+      <w:tr>
+        <w:tc>
+          <w:tcPr>
+            <w:tcW w:type="dxa" w:w="9298"/>
+          </w:tcPr>
+          <w:p>
+            <w:pPr>
+              <w:spacing w:after="0"/>
+            </w:pPr>
+            <w:r>
+              <w:rPr>
+                <w:color w:val="666666"/>
+                <w:sz w:val="17"/>
+              </w:rPr>
+              <w:t>Your answer</w:t>
+            </w:r>
+          </w:p>
+          <w:p>
+            <w:pPr>
+              <w:spacing w:after="0"/>
+            </w:pPr>
+          </w:p>
+          <w:p>
+            <w:pPr>
+              <w:spacing w:after="0"/>
+            </w:pPr>
+          </w:p>
+          <w:p>
+            <w:pPr>
+              <w:spacing w:after="0"/>
+            </w:pPr>
+          </w:p>
+        </w:tc>
+      </w:tr>
+    </w:tbl>
+    <w:p>
+      <w:pPr>
+        <w:spacing w:after="80"/>
+      </w:pPr>
+    </w:p>
+    <w:p>
+      <w:pPr>
+        <w:keepNext/>
+        <w:spacing w:before="240" w:after="60"/>
+      </w:pPr>
+      <w:r>
+        <w:rPr>
+          <w:b/>
+          <w:color w:val="111111"/>
+          <w:sz w:val="25"/>
+        </w:rPr>
+        <w:t>Question 18  —  Should cost per m² keep falling as a building gets taller?</w:t>
+      </w:r>
+    </w:p>
+    <w:p>
+      <w:pPr>
+        <w:spacing w:after="40"/>
+      </w:pPr>
+      <w:r>
+        <w:rPr>
+          <w:b/>
+          <w:color w:val="111111"/>
+          <w:sz w:val="20"/>
+        </w:rPr>
+        <w:t>What your document shows</w:t>
+      </w:r>
+    </w:p>
+    <w:p>
+      <w:pPr>
+        <w:spacing w:after="60"/>
+      </w:pPr>
+      <w:r>
+        <w:rPr>
+          <w:b w:val="0"/>
+          <w:color w:val="111111"/>
+          <w:sz w:val="20"/>
+        </w:rPr>
+        <w:t>With the slab correction in, a Yaoundé building at a fixed footprint prices as below, measured against the 180,000 rule of thumb in Question 17.</w:t>
+      </w:r>
+    </w:p>
+    <w:p>
+      <w:pPr>
+        <w:spacing w:after="60"/>
+      </w:pPr>
+      <w:r>
+        <w:rPr>
+          <w:b w:val="0"/>
+          <w:color w:val="111111"/>
+          <w:sz w:val="20"/>
+        </w:rPr>
+        <w:t>Going from one storey to eight, we lose about 49% of the ratio. Before the slab fix it was 62%, so the correction closed roughly a fifth of the gap — but not the rest.</w:t>
+      </w:r>
+    </w:p>
+    <w:p>
+      <w:pPr>
+        <w:spacing w:after="60"/>
+      </w:pPr>
+      <w:r>
+        <w:rPr>
+          <w:b w:val="0"/>
+          <w:color w:val="111111"/>
+          <w:sz w:val="20"/>
+        </w:rPr>
+        <w:t>Some decay is real: a foundation and a site setup are paid once and spread over more floor area. We have no mechanism left that explains the remainder.</w:t>
+      </w:r>
+    </w:p>
+    <w:tbl>
+      <w:tblPr>
+        <w:tblW w:type="auto" w:w="0"/>
+        <w:jc w:val="left"/>
+        <w:tblLayout w:type="fixed"/>
+        <w:tblLook w:firstColumn="1" w:firstRow="1" w:lastColumn="0" w:lastRow="0" w:noHBand="0" w:noVBand="1" w:val="04A0"/>
+        <w:tblLayout w:type="fixed"/>
+        <w:tblBorders>
+          <w:top w:val="single" w:sz="4" w:color="BBBBBB"/>
+          <w:left w:val="single" w:sz="4" w:color="BBBBBB"/>
+          <w:bottom w:val="single" w:sz="4" w:color="BBBBBB"/>
+          <w:right w:val="single" w:sz="4" w:color="BBBBBB"/>
+          <w:insideH w:val="single" w:sz="4" w:color="BBBBBB"/>
+          <w:insideV w:val="single" w:sz="4" w:color="BBBBBB"/>
+        </w:tblBorders>
+      </w:tblPr>
+      <w:tblGrid>
+        <w:gridCol w:w="2268"/>
+        <w:gridCol w:w="3402"/>
+      </w:tblGrid>
+      <w:tr>
+        <w:trPr>
+          <w:cantSplit/>
+          <w:tblHeader w:val="true"/>
+        </w:trPr>
+        <w:tc>
+          <w:tcPr>
+            <w:tcW w:type="dxa" w:w="2268"/>
+            <w:shd w:fill="EDEDED"/>
+          </w:tcPr>
+          <w:p>
+            <w:pPr>
+              <w:spacing w:after="20"/>
+            </w:pPr>
+            <w:r>
+              <w:rPr>
+                <w:b/>
+                <w:sz w:val="19"/>
+              </w:rPr>
+              <w:t>Storeys</w:t>
+            </w:r>
+          </w:p>
+        </w:tc>
+        <w:tc>
+          <w:tcPr>
+            <w:tcW w:type="dxa" w:w="3402"/>
+            <w:shd w:fill="EDEDED"/>
+          </w:tcPr>
+          <w:p>
+            <w:pPr>
+              <w:spacing w:after="20"/>
+            </w:pPr>
+            <w:r>
+              <w:rPr>
+                <w:b/>
+                <w:sz w:val="19"/>
+              </w:rPr>
+              <w:t>Our cost ÷ rule of thumb</w:t>
+            </w:r>
+          </w:p>
+        </w:tc>
+      </w:tr>
+      <w:tr>
+        <w:trPr>
+          <w:cantSplit/>
+        </w:trPr>
+        <w:tc>
+          <w:tcPr>
+            <w:tcW w:type="dxa" w:w="2268"/>
+          </w:tcPr>
+          <w:p>
+            <w:pPr>
+              <w:spacing w:after="20"/>
+            </w:pPr>
+            <w:r>
+              <w:rPr>
+                <w:b w:val="0"/>
+                <w:color w:val="111111"/>
+                <w:sz w:val="19"/>
+              </w:rPr>
+              <w:t>1</w:t>
+            </w:r>
+          </w:p>
+        </w:tc>
+        <w:tc>
+          <w:tcPr>
+            <w:tcW w:type="dxa" w:w="3402"/>
+          </w:tcPr>
+          <w:p>
+            <w:pPr>
+              <w:spacing w:after="20"/>
+            </w:pPr>
+            <w:r>
+              <w:rPr>
+                <w:b w:val="0"/>
+                <w:color w:val="111111"/>
+                <w:sz w:val="19"/>
+              </w:rPr>
+              <w:t>1.29</w:t>
+            </w:r>
+          </w:p>
+        </w:tc>
+      </w:tr>
+      <w:tr>
+        <w:trPr>
+          <w:cantSplit/>
+        </w:trPr>
+        <w:tc>
+          <w:tcPr>
+            <w:tcW w:type="dxa" w:w="2268"/>
+          </w:tcPr>
+          <w:p>
+            <w:pPr>
+              <w:spacing w:after="20"/>
+            </w:pPr>
+            <w:r>
+              <w:rPr>
+                <w:b w:val="0"/>
+                <w:color w:val="111111"/>
+                <w:sz w:val="19"/>
+              </w:rPr>
+              <w:t>2</w:t>
+            </w:r>
+          </w:p>
+        </w:tc>
+        <w:tc>
+          <w:tcPr>
+            <w:tcW w:type="dxa" w:w="3402"/>
+          </w:tcPr>
+          <w:p>
+            <w:pPr>
+              <w:spacing w:after="20"/>
+            </w:pPr>
+            <w:r>
+              <w:rPr>
+                <w:b w:val="0"/>
+                <w:color w:val="111111"/>
+                <w:sz w:val="19"/>
+              </w:rPr>
+              <w:t>0.84</w:t>
+            </w:r>
+          </w:p>
+        </w:tc>
+      </w:tr>
+      <w:tr>
+        <w:trPr>
+          <w:cantSplit/>
+        </w:trPr>
+        <w:tc>
+          <w:tcPr>
+            <w:tcW w:type="dxa" w:w="2268"/>
+          </w:tcPr>
+          <w:p>
+            <w:pPr>
+              <w:spacing w:after="20"/>
+            </w:pPr>
+            <w:r>
+              <w:rPr>
+                <w:b w:val="0"/>
+                <w:color w:val="111111"/>
+                <w:sz w:val="19"/>
+              </w:rPr>
+              <w:t>4</w:t>
+            </w:r>
+          </w:p>
+        </w:tc>
+        <w:tc>
+          <w:tcPr>
+            <w:tcW w:type="dxa" w:w="3402"/>
+          </w:tcPr>
+          <w:p>
+            <w:pPr>
+              <w:spacing w:after="20"/>
+            </w:pPr>
+            <w:r>
+              <w:rPr>
+                <w:b w:val="0"/>
+                <w:color w:val="111111"/>
+                <w:sz w:val="19"/>
+              </w:rPr>
+              <w:t>0.70</w:t>
+            </w:r>
+          </w:p>
+        </w:tc>
+      </w:tr>
+      <w:tr>
+        <w:trPr>
+          <w:cantSplit/>
+        </w:trPr>
+        <w:tc>
+          <w:tcPr>
+            <w:tcW w:type="dxa" w:w="2268"/>
+          </w:tcPr>
+          <w:p>
+            <w:pPr>
+              <w:spacing w:after="20"/>
+            </w:pPr>
+            <w:r>
+              <w:rPr>
+                <w:b w:val="0"/>
+                <w:color w:val="111111"/>
+                <w:sz w:val="19"/>
+              </w:rPr>
+              <w:t>8</w:t>
+            </w:r>
+          </w:p>
+        </w:tc>
+        <w:tc>
+          <w:tcPr>
+            <w:tcW w:type="dxa" w:w="3402"/>
+          </w:tcPr>
+          <w:p>
+            <w:pPr>
+              <w:spacing w:after="20"/>
+            </w:pPr>
+            <w:r>
+              <w:rPr>
+                <w:b w:val="0"/>
+                <w:color w:val="111111"/>
+                <w:sz w:val="19"/>
+              </w:rPr>
+              <w:t>0.63</w:t>
+            </w:r>
+          </w:p>
+        </w:tc>
+      </w:tr>
+      <w:tr>
+        <w:trPr>
+          <w:cantSplit/>
+        </w:trPr>
+        <w:tc>
+          <w:tcPr>
+            <w:tcW w:type="dxa" w:w="2268"/>
+          </w:tcPr>
+          <w:p>
+            <w:pPr>
+              <w:spacing w:after="20"/>
+            </w:pPr>
+            <w:r>
+              <w:rPr>
+                <w:b w:val="0"/>
+                <w:color w:val="111111"/>
+                <w:sz w:val="19"/>
+              </w:rPr>
+              <w:t>12</w:t>
+            </w:r>
+          </w:p>
+        </w:tc>
+        <w:tc>
+          <w:tcPr>
+            <w:tcW w:type="dxa" w:w="3402"/>
+          </w:tcPr>
+          <w:p>
+            <w:pPr>
+              <w:spacing w:after="20"/>
+            </w:pPr>
+            <w:r>
+              <w:rPr>
+                <w:b w:val="0"/>
+                <w:color w:val="111111"/>
+                <w:sz w:val="19"/>
+              </w:rPr>
+              <w:t>0.61</w:t>
+            </w:r>
+          </w:p>
+        </w:tc>
+      </w:tr>
+    </w:tbl>
+    <w:p>
+      <w:pPr>
+        <w:spacing w:after="40"/>
+      </w:pPr>
+    </w:p>
+    <w:p>
+      <w:pPr>
+        <w:spacing w:after="40"/>
+      </w:pPr>
+      <w:r>
+        <w:rPr>
+          <w:b/>
+          <w:color w:val="111111"/>
+          <w:sz w:val="20"/>
+        </w:rPr>
+        <w:t>What we have assumed in the meantime</w:t>
+      </w:r>
+    </w:p>
+    <w:p>
+      <w:pPr>
+        <w:spacing w:after="80"/>
+      </w:pPr>
+      <w:r>
+        <w:rPr>
+          <w:b w:val="0"/>
+          <w:color w:val="111111"/>
+          <w:sz w:val="20"/>
+        </w:rPr>
+        <w:t>That the remaining decay is correct, which we do not actually believe.</w:t>
+      </w:r>
+    </w:p>
+    <w:p>
+      <w:pPr>
+        <w:spacing w:after="40"/>
+      </w:pPr>
+      <w:r>
+        <w:rPr>
+          <w:b/>
+          <w:color w:val="111111"/>
+          <w:sz w:val="20"/>
+        </w:rPr>
+        <w:t>What we need from you</w:t>
+      </w:r>
+    </w:p>
+    <w:p>
+      <w:r>
+        <w:rPr>
+          <w:b/>
+          <w:color w:val="111111"/>
+          <w:sz w:val="21"/>
+        </w:rPr>
+        <w:t>Is losing about half the rate per m² over eight storeys right, or should a tall building cost nearer a flat rate per m²?</w:t>
+      </w:r>
+    </w:p>
+    <w:tbl>
+      <w:tblPr>
+        <w:tblW w:type="auto" w:w="0"/>
+        <w:jc w:val="left"/>
+        <w:tblLayout w:type="fixed"/>
+        <w:tblLook w:firstColumn="1" w:firstRow="1" w:lastColumn="0" w:lastRow="0" w:noHBand="0" w:noVBand="1" w:val="04A0"/>
+        <w:tblLayout w:type="fixed"/>
+        <w:tblBorders>
+          <w:top w:val="single" w:sz="4" w:color="999999"/>
+          <w:left w:val="single" w:sz="4" w:color="999999"/>
+          <w:bottom w:val="single" w:sz="4" w:color="999999"/>
+          <w:right w:val="single" w:sz="4" w:color="999999"/>
+          <w:insideH w:val="single" w:sz="4" w:color="999999"/>
+          <w:insideV w:val="single" w:sz="4" w:color="999999"/>
+        </w:tblBorders>
+      </w:tblPr>
+      <w:tblGrid>
+        <w:gridCol w:w="9298"/>
+      </w:tblGrid>
+      <w:tr>
+        <w:tc>
+          <w:tcPr>
+            <w:tcW w:type="dxa" w:w="9298"/>
+          </w:tcPr>
+          <w:p>
+            <w:pPr>
+              <w:spacing w:after="0"/>
+            </w:pPr>
+            <w:r>
+              <w:rPr>
+                <w:color w:val="666666"/>
+                <w:sz w:val="17"/>
+              </w:rPr>
+              <w:t>Your answer</w:t>
+            </w:r>
+          </w:p>
+          <w:p>
+            <w:pPr>
+              <w:spacing w:after="0"/>
+            </w:pPr>
+          </w:p>
+          <w:p>
+            <w:pPr>
+              <w:spacing w:after="0"/>
+            </w:pPr>
+          </w:p>
+          <w:p>
+            <w:pPr>
+              <w:spacing w:after="0"/>
+            </w:pPr>
+          </w:p>
+          <w:p>
+            <w:pPr>
+              <w:spacing w:after="0"/>
+            </w:pPr>
+          </w:p>
+        </w:tc>
+      </w:tr>
+    </w:tbl>
+    <w:p>
+      <w:pPr>
+        <w:spacing w:after="80"/>
+      </w:pPr>
+    </w:p>
+    <w:p>
+      <w:pPr>
+        <w:spacing w:after="40"/>
+      </w:pPr>
+      <w:r>
+        <w:rPr>
+          <w:b/>
+          <w:color w:val="111111"/>
+          <w:sz w:val="20"/>
+        </w:rPr>
+        <w:t>Two smaller ones in the same area.</w:t>
+      </w:r>
+    </w:p>
+    <w:p>
+      <w:pPr>
+        <w:spacing w:after="60"/>
+      </w:pPr>
+      <w:r>
+        <w:rPr>
+          <w:b w:val="0"/>
+          <w:color w:val="111111"/>
+          <w:sz w:val="20"/>
+        </w:rPr>
+        <w:t>Should a bungalow be charged a suspended floor slab at all? We charge one today. A single-storey building under a pitched roof does not have one — but no document in the set is a bungalow, so there is nothing to calibrate against, and it is the commonest building our clients ask for.</w:t>
+      </w:r>
+    </w:p>
+    <w:p>
+      <w:pPr>
+        <w:spacing w:after="60"/>
+      </w:pPr>
+      <w:r>
+        <w:rPr>
+          <w:b w:val="0"/>
+          <w:color w:val="111111"/>
+          <w:sz w:val="20"/>
+        </w:rPr>
+        <w:t>Partition walls and bathroom tiling scale with the total room count rather than per floor, so a tall building with a fixed number of rooms gets a shrinking allowance per floor. Is that right?</w:t>
+      </w:r>
+    </w:p>
+    <w:tbl>
+      <w:tblPr>
+        <w:tblW w:type="auto" w:w="0"/>
+        <w:jc w:val="left"/>
+        <w:tblLayout w:type="fixed"/>
+        <w:tblLook w:firstColumn="1" w:firstRow="1" w:lastColumn="0" w:lastRow="0" w:noHBand="0" w:noVBand="1" w:val="04A0"/>
+        <w:tblLayout w:type="fixed"/>
+        <w:tblBorders>
+          <w:top w:val="single" w:sz="4" w:color="999999"/>
+          <w:left w:val="single" w:sz="4" w:color="999999"/>
+          <w:bottom w:val="single" w:sz="4" w:color="999999"/>
+          <w:right w:val="single" w:sz="4" w:color="999999"/>
+          <w:insideH w:val="single" w:sz="4" w:color="999999"/>
+          <w:insideV w:val="single" w:sz="4" w:color="999999"/>
+        </w:tblBorders>
+      </w:tblPr>
+      <w:tblGrid>
+        <w:gridCol w:w="9298"/>
+      </w:tblGrid>
+      <w:tr>
+        <w:tc>
+          <w:tcPr>
+            <w:tcW w:type="dxa" w:w="9298"/>
+          </w:tcPr>
+          <w:p>
+            <w:pPr>
+              <w:spacing w:after="0"/>
+            </w:pPr>
+            <w:r>
+              <w:rPr>
+                <w:color w:val="666666"/>
+                <w:sz w:val="17"/>
+              </w:rPr>
+              <w:t>Your answer</w:t>
+            </w:r>
           </w:p>
           <w:p>
             <w:pPr>
@@ -9966,11 +11053,155 @@
           </w:p>
         </w:tc>
       </w:tr>
+      <w:tr>
+        <w:trPr>
+          <w:cantSplit/>
+        </w:trPr>
+        <w:tc>
+          <w:tcPr>
+            <w:tcW w:type="dxa" w:w="2041"/>
+          </w:tcPr>
+          <w:p>
+            <w:pPr>
+              <w:spacing w:after="20"/>
+            </w:pPr>
+            <w:r>
+              <w:rPr>
+                <w:b w:val="0"/>
+                <w:color w:val="111111"/>
+                <w:sz w:val="19"/>
+              </w:rPr>
+              <w:t>16</w:t>
+            </w:r>
+          </w:p>
+        </w:tc>
+        <w:tc>
+          <w:tcPr>
+            <w:tcW w:type="dxa" w:w="7257"/>
+          </w:tcPr>
+          <w:p>
+            <w:pPr>
+              <w:spacing w:after="20"/>
+            </w:pPr>
+            <w:r>
+              <w:rPr>
+                <w:b w:val="0"/>
+                <w:color w:val="111111"/>
+                <w:sz w:val="19"/>
+              </w:rPr>
+              <w:t>We know whether the slab correction landed right or overshot</w:t>
+            </w:r>
+          </w:p>
+        </w:tc>
+      </w:tr>
+      <w:tr>
+        <w:trPr>
+          <w:cantSplit/>
+        </w:trPr>
+        <w:tc>
+          <w:tcPr>
+            <w:tcW w:type="dxa" w:w="2041"/>
+          </w:tcPr>
+          <w:p>
+            <w:pPr>
+              <w:spacing w:after="20"/>
+            </w:pPr>
+            <w:r>
+              <w:rPr>
+                <w:b w:val="0"/>
+                <w:color w:val="111111"/>
+                <w:sz w:val="19"/>
+              </w:rPr>
+              <w:t>17</w:t>
+            </w:r>
+          </w:p>
+        </w:tc>
+        <w:tc>
+          <w:tcPr>
+            <w:tcW w:type="dxa" w:w="7257"/>
+          </w:tcPr>
+          <w:p>
+            <w:pPr>
+              <w:spacing w:after="20"/>
+            </w:pPr>
+            <w:r>
+              <w:rPr>
+                <w:b w:val="0"/>
+                <w:color w:val="111111"/>
+                <w:sz w:val="19"/>
+              </w:rPr>
+              <w:t>Our low-estimate warning is calibrated against a real benchmark</w:t>
+            </w:r>
+          </w:p>
+        </w:tc>
+      </w:tr>
+      <w:tr>
+        <w:trPr>
+          <w:cantSplit/>
+        </w:trPr>
+        <w:tc>
+          <w:tcPr>
+            <w:tcW w:type="dxa" w:w="2041"/>
+          </w:tcPr>
+          <w:p>
+            <w:pPr>
+              <w:spacing w:after="20"/>
+            </w:pPr>
+            <w:r>
+              <w:rPr>
+                <w:b w:val="0"/>
+                <w:color w:val="111111"/>
+                <w:sz w:val="19"/>
+              </w:rPr>
+              <w:t>18</w:t>
+            </w:r>
+          </w:p>
+        </w:tc>
+        <w:tc>
+          <w:tcPr>
+            <w:tcW w:type="dxa" w:w="7257"/>
+          </w:tcPr>
+          <w:p>
+            <w:pPr>
+              <w:spacing w:after="20"/>
+            </w:pPr>
+            <w:r>
+              <w:rPr>
+                <w:b w:val="0"/>
+                <w:color w:val="111111"/>
+                <w:sz w:val="19"/>
+              </w:rPr>
+              <w:t>Tall buildings are priced on your judgement, not on an unexplained decay</w:t>
+            </w:r>
+          </w:p>
+        </w:tc>
+      </w:tr>
     </w:tbl>
     <w:p>
       <w:pPr>
         <w:spacing w:after="40"/>
       </w:pPr>
+    </w:p>
+    <w:p>
+      <w:pPr>
+        <w:spacing w:after="160"/>
+      </w:pPr>
+      <w:r>
+        <w:rPr>
+          <w:b/>
+          <w:color w:val="111111"/>
+          <w:sz w:val="20"/>
+        </w:rPr>
+        <w:t>If you can only answer three, please make them 17, 18 and 15.</w:t>
+      </w:r>
+      <w:r>
+        <w:rPr>
+          <w:b w:val="0"/>
+          <w:color w:val="111111"/>
+          <w:sz w:val="20"/>
+        </w:rPr>
+        <w:t xml:space="preserve">  17 and 18 decide whether tall buildings are priced correctly at all — the thing our testers actually complained about — and 15 is nine rates a contractor can currently see marked as our guesses.</w:t>
+      </w:r>
     </w:p>
     <w:p>
       <w:pPr>

</xml_diff>